<commit_message>
docs: biểu đồ trạng thái Order vẽ bằng VP (mục 6.8)
VP MCP plugin nay có tool state machine (submodule 8ca979f). Vẽ biểu đồ
trạng thái đơn hàng trong VP: Start → Pending → Approved → ReadyForExport
→ Exported → Delivering → Delivered → End, nhánh Cancelled từ Pending và
Approved, self-transition "pack goods" và "export() [stock missing]".

Mục 6.8 trong 34_B23DCAT280.docx nay là ảnh Hình 6.4, không còn code
PlantUML. Cả 4 biểu đồ module 2 giờ đều là ảnh VP.

Co-Authored-By: Claude Opus 5 (1M context) <noreply@anthropic.com>
</commit_message>
<xml_diff>
--- a/34_B23DCAT280.docx
+++ b/34_B23DCAT280.docx
@@ -25443,330 +25443,55 @@
     </w:p>
     <w:p>
       <w:pPr>
-        <w:spacing w:after="0" w:before="0"/>
-      </w:pPr>
-      <w:r>
-        <w:rPr>
-          <w:rFonts w:ascii="Consolas" w:hAnsi="Consolas"/>
-          <w:color w:val="1F3764"/>
-          <w:sz w:val="17"/>
-        </w:rPr>
-        <w:t>@startuml</w:t>
-      </w:r>
-    </w:p>
-    <w:p>
-      <w:pPr>
-        <w:spacing w:after="0" w:before="0"/>
-      </w:pPr>
-      <w:r>
-        <w:rPr>
-          <w:rFonts w:ascii="Consolas" w:hAnsi="Consolas"/>
-          <w:color w:val="1F3764"/>
-          <w:sz w:val="17"/>
-        </w:rPr>
-        <w:t>title Bieu do trang thai - Order (Module duyet va xuat don hang)</w:t>
-      </w:r>
-    </w:p>
-    <w:p>
-      <w:pPr>
-        <w:spacing w:after="0" w:before="0"/>
-      </w:pPr>
-      <w:r>
-        <w:rPr>
-          <w:rFonts w:ascii="Consolas" w:hAnsi="Consolas"/>
-          <w:color w:val="1F3764"/>
-          <w:sz w:val="17"/>
-        </w:rPr>
-        <w:t xml:space="preserve"> </w:t>
-      </w:r>
-    </w:p>
-    <w:p>
-      <w:pPr>
-        <w:spacing w:after="0" w:before="0"/>
-      </w:pPr>
-      <w:r>
-        <w:rPr>
-          <w:rFonts w:ascii="Consolas" w:hAnsi="Consolas"/>
-          <w:color w:val="1F3764"/>
-          <w:sz w:val="17"/>
-        </w:rPr>
-        <w:t>[*] --&gt; Pending : khach hang dat don truc tuyen</w:t>
-      </w:r>
-    </w:p>
-    <w:p>
-      <w:pPr>
-        <w:spacing w:after="0" w:before="0"/>
-      </w:pPr>
-      <w:r>
-        <w:rPr>
-          <w:rFonts w:ascii="Consolas" w:hAnsi="Consolas"/>
-          <w:color w:val="1F3764"/>
-          <w:sz w:val="17"/>
-        </w:rPr>
-        <w:t xml:space="preserve"> </w:t>
-      </w:r>
-    </w:p>
-    <w:p>
-      <w:pPr>
-        <w:spacing w:after="0" w:before="0"/>
-      </w:pPr>
-      <w:r>
-        <w:rPr>
-          <w:rFonts w:ascii="Consolas" w:hAnsi="Consolas"/>
-          <w:color w:val="1F3764"/>
-          <w:sz w:val="17"/>
-        </w:rPr>
-        <w:t>state Pending</w:t>
-      </w:r>
-    </w:p>
-    <w:p>
-      <w:pPr>
-        <w:spacing w:after="0" w:before="0"/>
-      </w:pPr>
-      <w:r>
-        <w:rPr>
-          <w:rFonts w:ascii="Consolas" w:hAnsi="Consolas"/>
-          <w:color w:val="1F3764"/>
-          <w:sz w:val="17"/>
-        </w:rPr>
-        <w:t>state Approved</w:t>
-      </w:r>
-    </w:p>
-    <w:p>
-      <w:pPr>
-        <w:spacing w:after="0" w:before="0"/>
-      </w:pPr>
-      <w:r>
-        <w:rPr>
-          <w:rFonts w:ascii="Consolas" w:hAnsi="Consolas"/>
-          <w:color w:val="1F3764"/>
-          <w:sz w:val="17"/>
-        </w:rPr>
-        <w:t>state ReadyForExport</w:t>
-      </w:r>
-    </w:p>
-    <w:p>
-      <w:pPr>
-        <w:spacing w:after="0" w:before="0"/>
-      </w:pPr>
-      <w:r>
-        <w:rPr>
-          <w:rFonts w:ascii="Consolas" w:hAnsi="Consolas"/>
-          <w:color w:val="1F3764"/>
-          <w:sz w:val="17"/>
-        </w:rPr>
-        <w:t>state Exported</w:t>
-      </w:r>
-    </w:p>
-    <w:p>
-      <w:pPr>
-        <w:spacing w:after="0" w:before="0"/>
-      </w:pPr>
-      <w:r>
-        <w:rPr>
-          <w:rFonts w:ascii="Consolas" w:hAnsi="Consolas"/>
-          <w:color w:val="1F3764"/>
-          <w:sz w:val="17"/>
-        </w:rPr>
-        <w:t>state Delivering</w:t>
-      </w:r>
-    </w:p>
-    <w:p>
-      <w:pPr>
-        <w:spacing w:after="0" w:before="0"/>
-      </w:pPr>
-      <w:r>
-        <w:rPr>
-          <w:rFonts w:ascii="Consolas" w:hAnsi="Consolas"/>
-          <w:color w:val="1F3764"/>
-          <w:sz w:val="17"/>
-        </w:rPr>
-        <w:t>state Delivered</w:t>
-      </w:r>
-    </w:p>
-    <w:p>
-      <w:pPr>
-        <w:spacing w:after="0" w:before="0"/>
-      </w:pPr>
-      <w:r>
-        <w:rPr>
-          <w:rFonts w:ascii="Consolas" w:hAnsi="Consolas"/>
-          <w:color w:val="1F3764"/>
-          <w:sz w:val="17"/>
-        </w:rPr>
-        <w:t>state Cancelled</w:t>
-      </w:r>
-    </w:p>
-    <w:p>
-      <w:pPr>
-        <w:spacing w:after="0" w:before="0"/>
-      </w:pPr>
-      <w:r>
-        <w:rPr>
-          <w:rFonts w:ascii="Consolas" w:hAnsi="Consolas"/>
-          <w:color w:val="1F3764"/>
-          <w:sz w:val="17"/>
-        </w:rPr>
-        <w:t xml:space="preserve"> </w:t>
-      </w:r>
-    </w:p>
-    <w:p>
-      <w:pPr>
-        <w:spacing w:after="0" w:before="0"/>
-      </w:pPr>
-      <w:r>
-        <w:rPr>
-          <w:rFonts w:ascii="Consolas" w:hAnsi="Consolas"/>
-          <w:color w:val="1F3764"/>
-          <w:sz w:val="17"/>
-        </w:rPr>
-        <w:t>Pending --&gt; Approved : approve() / luu nhan vien duyet va thoi diem duyet</w:t>
-      </w:r>
-    </w:p>
-    <w:p>
-      <w:pPr>
-        <w:spacing w:after="0" w:before="0"/>
-      </w:pPr>
-      <w:r>
-        <w:rPr>
-          <w:rFonts w:ascii="Consolas" w:hAnsi="Consolas"/>
-          <w:color w:val="1F3764"/>
-          <w:sz w:val="17"/>
-        </w:rPr>
-        <w:t>Pending --&gt; Cancelled : huy don</w:t>
-      </w:r>
-    </w:p>
-    <w:p>
-      <w:pPr>
-        <w:spacing w:after="0" w:before="0"/>
-      </w:pPr>
-      <w:r>
-        <w:rPr>
-          <w:rFonts w:ascii="Consolas" w:hAnsi="Consolas"/>
-          <w:color w:val="1F3764"/>
-          <w:sz w:val="17"/>
-        </w:rPr>
-        <w:t>Approved --&gt; Approved : dong goi hang hoa</w:t>
-      </w:r>
-    </w:p>
-    <w:p>
-      <w:pPr>
-        <w:spacing w:after="0" w:before="0"/>
-      </w:pPr>
-      <w:r>
-        <w:rPr>
-          <w:rFonts w:ascii="Consolas" w:hAnsi="Consolas"/>
-          <w:color w:val="1F3764"/>
-          <w:sz w:val="17"/>
-        </w:rPr>
-        <w:t>Approved --&gt; ReadyForExport : assignDelivery() / luu nhan vien giao hang</w:t>
-      </w:r>
-    </w:p>
-    <w:p>
-      <w:pPr>
-        <w:spacing w:after="0" w:before="0"/>
-      </w:pPr>
-      <w:r>
-        <w:rPr>
-          <w:rFonts w:ascii="Consolas" w:hAnsi="Consolas"/>
-          <w:color w:val="1F3764"/>
-          <w:sz w:val="17"/>
-        </w:rPr>
-        <w:t>Approved --&gt; Cancelled : huy don</w:t>
-      </w:r>
-    </w:p>
-    <w:p>
-      <w:pPr>
-        <w:spacing w:after="0" w:before="0"/>
-      </w:pPr>
-      <w:r>
-        <w:rPr>
-          <w:rFonts w:ascii="Consolas" w:hAnsi="Consolas"/>
-          <w:color w:val="1F3764"/>
-          <w:sz w:val="17"/>
-        </w:rPr>
-        <w:t>ReadyForExport --&gt; ReadyForExport : export() [thieu ton kho] / tu choi xuat, giu nguyen ton kho</w:t>
-      </w:r>
-    </w:p>
-    <w:p>
-      <w:pPr>
-        <w:spacing w:after="0" w:before="0"/>
-      </w:pPr>
-      <w:r>
-        <w:rPr>
-          <w:rFonts w:ascii="Consolas" w:hAnsi="Consolas"/>
-          <w:color w:val="1F3764"/>
-          <w:sz w:val="17"/>
-        </w:rPr>
-        <w:t>ReadyForExport --&gt; Exported : export() [du ton kho] / tru ton kho, luu thoi diem xuat, cap nhat hoa don</w:t>
-      </w:r>
-    </w:p>
-    <w:p>
-      <w:pPr>
-        <w:spacing w:after="0" w:before="0"/>
-      </w:pPr>
-      <w:r>
-        <w:rPr>
-          <w:rFonts w:ascii="Consolas" w:hAnsi="Consolas"/>
-          <w:color w:val="1F3764"/>
-          <w:sz w:val="17"/>
-        </w:rPr>
-        <w:t>Exported --&gt; Delivering : ban giao hang va hoa don cho nhan vien giao hang</w:t>
-      </w:r>
-    </w:p>
-    <w:p>
-      <w:pPr>
-        <w:spacing w:after="0" w:before="0"/>
-      </w:pPr>
-      <w:r>
-        <w:rPr>
-          <w:rFonts w:ascii="Consolas" w:hAnsi="Consolas"/>
-          <w:color w:val="1F3764"/>
-          <w:sz w:val="17"/>
-        </w:rPr>
-        <w:t>Delivering --&gt; Delivered : khach hang nhan hang</w:t>
-      </w:r>
-    </w:p>
-    <w:p>
-      <w:pPr>
-        <w:spacing w:after="0" w:before="0"/>
-      </w:pPr>
-      <w:r>
-        <w:rPr>
-          <w:rFonts w:ascii="Consolas" w:hAnsi="Consolas"/>
-          <w:color w:val="1F3764"/>
-          <w:sz w:val="17"/>
-        </w:rPr>
-        <w:t>Delivered --&gt; [*]</w:t>
-      </w:r>
-    </w:p>
-    <w:p>
-      <w:pPr>
-        <w:spacing w:after="0" w:before="0"/>
-      </w:pPr>
-      <w:r>
-        <w:rPr>
-          <w:rFonts w:ascii="Consolas" w:hAnsi="Consolas"/>
-          <w:color w:val="1F3764"/>
-          <w:sz w:val="17"/>
-        </w:rPr>
-        <w:t>Cancelled --&gt; [*]</w:t>
-      </w:r>
-    </w:p>
-    <w:p>
-      <w:pPr>
-        <w:spacing w:after="0" w:before="0"/>
-      </w:pPr>
-      <w:r>
-        <w:rPr>
-          <w:rFonts w:ascii="Consolas" w:hAnsi="Consolas"/>
-          <w:color w:val="1F3764"/>
-          <w:sz w:val="17"/>
-        </w:rPr>
-        <w:t>@enduml</w:t>
-      </w:r>
-    </w:p>
-    <w:p/>
+        <w:jc w:val="center"/>
+      </w:pPr>
+      <w:r>
+        <w:drawing>
+          <wp:inline>
+            <wp:extent cx="5760720" cy="1025921"/>
+            <wp:docPr id="7" name="Picture 7"/>
+            <wp:cNvGraphicFramePr>
+              <a:graphicFrameLocks noChangeAspect="1"/>
+            </wp:cNvGraphicFramePr>
+            <a:graphic>
+              <a:graphicData uri="http://schemas.openxmlformats.org/drawingml/2006/picture">
+                <pic:pic>
+                  <pic:nvPicPr>
+                    <pic:cNvPr id="0" name="state_order.png"/>
+                    <pic:cNvPicPr/>
+                  </pic:nvPicPr>
+                  <pic:blipFill>
+                    <a:blip r:embed="rId14"/>
+                    <a:stretch>
+                      <a:fillRect/>
+                    </a:stretch>
+                  </pic:blipFill>
+                  <pic:spPr>
+                    <a:xfrm>
+                      <a:off x="0" y="0"/>
+                      <a:ext cx="5760720" cy="1025921"/>
+                    </a:xfrm>
+                    <a:prstGeom prst="rect"/>
+                  </pic:spPr>
+                </pic:pic>
+              </a:graphicData>
+            </a:graphic>
+          </wp:inline>
+        </w:drawing>
+      </w:r>
+    </w:p>
+    <w:p>
+      <w:pPr>
+        <w:jc w:val="center"/>
+      </w:pPr>
+      <w:r>
+        <w:rPr>
+          <w:i/>
+          <w:sz w:val="20"/>
+        </w:rPr>
+        <w:t>Hình 6.4 - Biểu đồ trạng thái của đơn hàng (Visual Paradigm)</w:t>
+      </w:r>
+    </w:p>
     <w:p>
       <w:r>
         <w:rPr>
@@ -25936,7 +25661,6 @@
         </w:tc>
       </w:tr>
     </w:tbl>
-    <w:p/>
     <w:p>
       <w:pPr>
         <w:pStyle w:val="Heading2"/>

</xml_diff>